<commit_message>
Remove GitHub links from the Group 15 submission report
</commit_message>
<xml_diff>
--- a/report/cloud-review/15.docx
+++ b/report/cloud-review/15.docx
@@ -882,7 +882,7 @@
     </w:p>
     <w:p>
       <w:r>
-        <w:t>Dataset source: https://raw.githubusercontent.com/IBM/telco-customer-churn-on-icp4d/master/data/Telco-Customer-Churn.csv</w:t>
+        <w:t>Dataset source: IBM Telco Customer Churn public dataset.</w:t>
       </w:r>
     </w:p>
     <w:p>
@@ -6125,27 +6125,6 @@
       </w:hyperlink>
     </w:p>
     <w:p>
-      <w:pPr>
-        <w:spacing w:after="100"/>
-      </w:pPr>
-      <w:r>
-        <w:rPr>
-          <w:sz w:val="20"/>
-        </w:rPr>
-        <w:t xml:space="preserve">Source code: </w:t>
-      </w:r>
-      <w:hyperlink r:id="rId25">
-        <w:r>
-          <w:rPr>
-            <w:sz w:val="20"/>
-            <w:color w:val="0563C1"/>
-            <w:u w:val="single"/>
-          </w:rPr>
-          <w:t>https://github.com/I30398/BITS_API_Assignment1</w:t>
-        </w:r>
-      </w:hyperlink>
-    </w:p>
-    <w:p>
       <w:r>
         <w:t>Dataset SHA256: 16320c9c1ec72448db59aa0a26a0b95401046bef5d02fd3aeb906448e3055e91</w:t>
       </w:r>

</xml_diff>